<commit_message>
Cap nhat lai file Word LAB06
</commit_message>
<xml_diff>
--- a/LAB06/LAB6_NguyenSiQuynh_1250080157.docx
+++ b/LAB06/LAB6_NguyenSiQuynh_1250080157.docx
@@ -7134,13 +7134,14 @@
         <w:pStyle w:val="Heading2"/>
         <w:rPr>
           <w:color w:val="000000" w:themeColor="text1"/>
+          <w:lang w:val="vi-VN"/>
         </w:rPr>
       </w:pPr>
       <w:r>
         <w:rPr>
           <w:color w:val="000000" w:themeColor="text1"/>
         </w:rPr>
-        <w:t>3.12 Kiến trúc WinForms dự kiến, chưa lập trình</w:t>
+        <w:t>3.12 Kiến trúc WinForms dự kiến,</w:t>
       </w:r>
     </w:p>
     <w:p>
@@ -9904,6 +9905,7 @@
                 <w:color w:val="000000" w:themeColor="text1"/>
                 <w:sz w:val="15"/>
               </w:rPr>
+              <w:lastRenderedPageBreak/>
               <w:t>TC01</w:t>
             </w:r>
           </w:p>
@@ -9924,15 +9926,27 @@
                 <w:color w:val="000000" w:themeColor="text1"/>
                 <w:sz w:val="15"/>
               </w:rPr>
-              <w:t xml:space="preserve">Bệnh nhân mới, hợp lệ, thu đủ lệ </w:t>
-            </w:r>
+              <w:t>Bệnh nhân mới, hợp lệ, thu đủ lệ phí</w:t>
+            </w:r>
+          </w:p>
+        </w:tc>
+        <w:tc>
+          <w:tcPr>
+            <w:tcW w:w="2464" w:type="dxa"/>
+          </w:tcPr>
+          <w:p>
+            <w:pPr>
+              <w:spacing w:after="40"/>
+              <w:rPr>
+                <w:color w:val="000000" w:themeColor="text1"/>
+              </w:rPr>
+            </w:pPr>
             <w:r>
               <w:rPr>
                 <w:color w:val="000000" w:themeColor="text1"/>
                 <w:sz w:val="15"/>
               </w:rPr>
-              <w:lastRenderedPageBreak/>
-              <w:t>phí</w:t>
+              <w:t>Đăng ký/cấp hồ sơ</w:t>
             </w:r>
           </w:p>
         </w:tc>
@@ -9952,36 +9966,7 @@
                 <w:color w:val="000000" w:themeColor="text1"/>
                 <w:sz w:val="15"/>
               </w:rPr>
-              <w:lastRenderedPageBreak/>
-              <w:t>Đăng ký/cấp hồ sơ</w:t>
-            </w:r>
-          </w:p>
-        </w:tc>
-        <w:tc>
-          <w:tcPr>
-            <w:tcW w:w="2464" w:type="dxa"/>
-          </w:tcPr>
-          <w:p>
-            <w:pPr>
-              <w:spacing w:after="40"/>
-              <w:rPr>
-                <w:color w:val="000000" w:themeColor="text1"/>
-              </w:rPr>
-            </w:pPr>
-            <w:r>
-              <w:rPr>
-                <w:color w:val="000000" w:themeColor="text1"/>
-                <w:sz w:val="15"/>
-              </w:rPr>
-              <w:t xml:space="preserve">Có bệnh nhân, lệ phí, một hồ sơ; </w:t>
-            </w:r>
-            <w:r>
-              <w:rPr>
-                <w:color w:val="000000" w:themeColor="text1"/>
-                <w:sz w:val="15"/>
-              </w:rPr>
-              <w:lastRenderedPageBreak/>
-              <w:t>nguyên tử</w:t>
+              <w:t>Có bệnh nhân, lệ phí, một hồ sơ; nguyên tử</w:t>
             </w:r>
           </w:p>
         </w:tc>

</xml_diff>